<commit_message>
fix(evals): make every protocol compliant outside its planted violations
A correct reviewer should never be scored a false positive. Each protocol now
covers every requirement of the regulations it addresses, except its planted
violations: 312.23(a)(6)(iii) for IND protocols, 812.25 in order for IDE plans,
58.120(a) for GLP protocols, and 50.25 and 50.27 for consent forms. gcp-03 gains
benefits, confidentiality, injury, and voluntariness statements. gcp-02's IRB now
breaks only 56.107(a). Planted citations and quotes are unchanged. Two issue strings
were trimmed where text causing a second, unplanted violation was removed. All 46
citations still verify against eCFR. evals/review/audit.md records the checklist
and three residuals that the planted violations themselves cause.

Co-Authored-By: Claude Opus 5.5 <noreply@anthropic.com>
</commit_message>
<xml_diff>
--- a/evals/review/protocols/gcp-01.docx
+++ b/evals/review/protocols/gcp-01.docx
@@ -29,6 +29,11 @@
       </w:r>
     </w:p>
     <w:p>
+      <w:r>
+        <w:t xml:space="preserve">You will be assigned by chance, like flipping a coin, to take either MG-12 or a placebo, a pill with no active drug. Neither you nor the study team will know which one you take. About 300 people will take part in this study.</w:t>
+      </w:r>
+    </w:p>
+    <w:p>
       <w:pPr>
         <w:pStyle w:val="Heading1"/>
       </w:pPr>
@@ -42,6 +47,11 @@
       </w:r>
     </w:p>
     <w:p>
+      <w:r>
+        <w:t xml:space="preserve">MG-12 may harm an unborn baby in ways that are not yet known. You cannot take part if you are pregnant or breastfeeding, and you must use effective birth control during the study.</w:t>
+      </w:r>
+    </w:p>
+    <w:p>
       <w:pPr>
         <w:pStyle w:val="Heading1"/>
       </w:pPr>
@@ -117,6 +127,32 @@
     <w:p>
       <w:r>
         <w:t xml:space="preserve">For questions about the study or a research-related injury, call Dr. Rana Malik at 555-0142. For questions about your rights as a research participant, call the Lakeside IRB at 555-0199.</w:t>
+      </w:r>
+    </w:p>
+    <w:p>
+      <w:pPr>
+        <w:pStyle w:val="Heading1"/>
+      </w:pPr>
+      <w:r>
+        <w:t xml:space="preserve">Other Things to Know</w:t>
+      </w:r>
+    </w:p>
+    <w:p>
+      <w:r>
+        <w:t xml:space="preserve">MG-12, placebo, and all study visits and tests are provided at no cost to you. The study doctor may take you out of the study without your consent if staying in would harm you, if you become pregnant, or if the sponsor stops the study. If you decide to leave the study, the study doctor will ask you to come to a final safety visit. We will tell you about any new findings during the study that might affect your willingness to stay in it.</w:t>
+      </w:r>
+    </w:p>
+    <w:p>
+      <w:pPr>
+        <w:pStyle w:val="Heading1"/>
+      </w:pPr>
+      <w:r>
+        <w:t xml:space="preserve">ClinicalTrials.gov</w:t>
+      </w:r>
+    </w:p>
+    <w:p>
+      <w:r>
+        <w:t xml:space="preserve">A description of this clinical trial will be available on http://www.ClinicalTrials.gov, as required by U.S. Law. This Web site will not include information that can identify you. At most, the Web site will include a summary of the results. You can search this Web site at any time.</w:t>
       </w:r>
     </w:p>
     <w:p>

</xml_diff>